<commit_message>
feat: 新增 TikTok / Facebook 热点来源
- Platform 类型、平台标签、配色、平台 Tab 增加 tiktok/facebook
- mockBackend 补 TikTok(4)/Facebook(3) 示意热点 + 月度平台分布纳入
- 代码与文档标注真实数据来源限制(TikTok 需第三方;FB 以广告资料库为主)
- 需求文档 v3.0 §4.1/§6.2 同步更新

Co-Authored-By: Claude Opus 4.8 <noreply@anthropic.com>
</commit_message>
<xml_diff>
--- a/docs/平台需求文档.docx
+++ b/docs/平台需求文档.docx
@@ -111,7 +111,7 @@
     <w:sdt>
       <w:sdtPr>
         <w:alias w:val="Table of Contents"/>
-        <w:id w:val="147453885"/>
+        <w:id w:val="147451929"/>
       </w:sdtPr>
       <w:sdtContent>
         <w:p>
@@ -143,7 +143,7 @@
             <w:fldChar w:fldCharType="begin"/>
           </w:r>
           <w:r>
-            <w:instrText xml:space="preserve"> HYPERLINK \l _Toc29762 </w:instrText>
+            <w:instrText xml:space="preserve"> HYPERLINK \l _Toc31718 </w:instrText>
           </w:r>
           <w:r>
             <w:fldChar w:fldCharType="separate"/>
@@ -158,7 +158,7 @@
             <w:fldChar w:fldCharType="begin"/>
           </w:r>
           <w:r>
-            <w:instrText xml:space="preserve"> PAGEREF _Toc29762 \h </w:instrText>
+            <w:instrText xml:space="preserve"> PAGEREF _Toc31718 \h </w:instrText>
           </w:r>
           <w:r>
             <w:fldChar w:fldCharType="separate"/>
@@ -184,7 +184,7 @@
             <w:fldChar w:fldCharType="begin"/>
           </w:r>
           <w:r>
-            <w:instrText xml:space="preserve"> HYPERLINK \l _Toc1392 </w:instrText>
+            <w:instrText xml:space="preserve"> HYPERLINK \l _Toc17159 </w:instrText>
           </w:r>
           <w:r>
             <w:fldChar w:fldCharType="separate"/>
@@ -199,7 +199,7 @@
             <w:fldChar w:fldCharType="begin"/>
           </w:r>
           <w:r>
-            <w:instrText xml:space="preserve"> PAGEREF _Toc1392 \h </w:instrText>
+            <w:instrText xml:space="preserve"> PAGEREF _Toc17159 \h </w:instrText>
           </w:r>
           <w:r>
             <w:fldChar w:fldCharType="separate"/>
@@ -225,7 +225,7 @@
             <w:fldChar w:fldCharType="begin"/>
           </w:r>
           <w:r>
-            <w:instrText xml:space="preserve"> HYPERLINK \l _Toc275 </w:instrText>
+            <w:instrText xml:space="preserve"> HYPERLINK \l _Toc18546 </w:instrText>
           </w:r>
           <w:r>
             <w:fldChar w:fldCharType="separate"/>
@@ -240,7 +240,7 @@
             <w:fldChar w:fldCharType="begin"/>
           </w:r>
           <w:r>
-            <w:instrText xml:space="preserve"> PAGEREF _Toc275 \h </w:instrText>
+            <w:instrText xml:space="preserve"> PAGEREF _Toc18546 \h </w:instrText>
           </w:r>
           <w:r>
             <w:fldChar w:fldCharType="separate"/>
@@ -266,7 +266,7 @@
             <w:fldChar w:fldCharType="begin"/>
           </w:r>
           <w:r>
-            <w:instrText xml:space="preserve"> HYPERLINK \l _Toc1749 </w:instrText>
+            <w:instrText xml:space="preserve"> HYPERLINK \l _Toc30522 </w:instrText>
           </w:r>
           <w:r>
             <w:fldChar w:fldCharType="separate"/>
@@ -281,7 +281,7 @@
             <w:fldChar w:fldCharType="begin"/>
           </w:r>
           <w:r>
-            <w:instrText xml:space="preserve"> PAGEREF _Toc1749 \h </w:instrText>
+            <w:instrText xml:space="preserve"> PAGEREF _Toc30522 \h </w:instrText>
           </w:r>
           <w:r>
             <w:fldChar w:fldCharType="separate"/>
@@ -307,7 +307,7 @@
             <w:fldChar w:fldCharType="begin"/>
           </w:r>
           <w:r>
-            <w:instrText xml:space="preserve"> HYPERLINK \l _Toc14586 </w:instrText>
+            <w:instrText xml:space="preserve"> HYPERLINK \l _Toc32632 </w:instrText>
           </w:r>
           <w:r>
             <w:fldChar w:fldCharType="separate"/>
@@ -322,7 +322,7 @@
             <w:fldChar w:fldCharType="begin"/>
           </w:r>
           <w:r>
-            <w:instrText xml:space="preserve"> PAGEREF _Toc14586 \h </w:instrText>
+            <w:instrText xml:space="preserve"> PAGEREF _Toc32632 \h </w:instrText>
           </w:r>
           <w:r>
             <w:fldChar w:fldCharType="separate"/>
@@ -348,7 +348,7 @@
             <w:fldChar w:fldCharType="begin"/>
           </w:r>
           <w:r>
-            <w:instrText xml:space="preserve"> HYPERLINK \l _Toc4092 </w:instrText>
+            <w:instrText xml:space="preserve"> HYPERLINK \l _Toc29675 </w:instrText>
           </w:r>
           <w:r>
             <w:fldChar w:fldCharType="separate"/>
@@ -363,7 +363,7 @@
             <w:fldChar w:fldCharType="begin"/>
           </w:r>
           <w:r>
-            <w:instrText xml:space="preserve"> PAGEREF _Toc4092 \h </w:instrText>
+            <w:instrText xml:space="preserve"> PAGEREF _Toc29675 \h </w:instrText>
           </w:r>
           <w:r>
             <w:fldChar w:fldCharType="separate"/>
@@ -389,7 +389,7 @@
             <w:fldChar w:fldCharType="begin"/>
           </w:r>
           <w:r>
-            <w:instrText xml:space="preserve"> HYPERLINK \l _Toc23443 </w:instrText>
+            <w:instrText xml:space="preserve"> HYPERLINK \l _Toc20025 </w:instrText>
           </w:r>
           <w:r>
             <w:fldChar w:fldCharType="separate"/>
@@ -404,7 +404,7 @@
             <w:fldChar w:fldCharType="begin"/>
           </w:r>
           <w:r>
-            <w:instrText xml:space="preserve"> PAGEREF _Toc23443 \h </w:instrText>
+            <w:instrText xml:space="preserve"> PAGEREF _Toc20025 \h </w:instrText>
           </w:r>
           <w:r>
             <w:fldChar w:fldCharType="separate"/>
@@ -430,7 +430,7 @@
             <w:fldChar w:fldCharType="begin"/>
           </w:r>
           <w:r>
-            <w:instrText xml:space="preserve"> HYPERLINK \l _Toc31787 </w:instrText>
+            <w:instrText xml:space="preserve"> HYPERLINK \l _Toc15053 </w:instrText>
           </w:r>
           <w:r>
             <w:fldChar w:fldCharType="separate"/>
@@ -445,7 +445,7 @@
             <w:fldChar w:fldCharType="begin"/>
           </w:r>
           <w:r>
-            <w:instrText xml:space="preserve"> PAGEREF _Toc31787 \h </w:instrText>
+            <w:instrText xml:space="preserve"> PAGEREF _Toc15053 \h </w:instrText>
           </w:r>
           <w:r>
             <w:fldChar w:fldCharType="separate"/>
@@ -471,7 +471,7 @@
             <w:fldChar w:fldCharType="begin"/>
           </w:r>
           <w:r>
-            <w:instrText xml:space="preserve"> HYPERLINK \l _Toc28859 </w:instrText>
+            <w:instrText xml:space="preserve"> HYPERLINK \l _Toc23365 </w:instrText>
           </w:r>
           <w:r>
             <w:fldChar w:fldCharType="separate"/>
@@ -486,7 +486,7 @@
             <w:fldChar w:fldCharType="begin"/>
           </w:r>
           <w:r>
-            <w:instrText xml:space="preserve"> PAGEREF _Toc28859 \h </w:instrText>
+            <w:instrText xml:space="preserve"> PAGEREF _Toc23365 \h </w:instrText>
           </w:r>
           <w:r>
             <w:fldChar w:fldCharType="separate"/>
@@ -512,7 +512,7 @@
             <w:fldChar w:fldCharType="begin"/>
           </w:r>
           <w:r>
-            <w:instrText xml:space="preserve"> HYPERLINK \l _Toc11955 </w:instrText>
+            <w:instrText xml:space="preserve"> HYPERLINK \l _Toc32047 </w:instrText>
           </w:r>
           <w:r>
             <w:fldChar w:fldCharType="separate"/>
@@ -527,7 +527,7 @@
             <w:fldChar w:fldCharType="begin"/>
           </w:r>
           <w:r>
-            <w:instrText xml:space="preserve"> PAGEREF _Toc11955 \h </w:instrText>
+            <w:instrText xml:space="preserve"> PAGEREF _Toc32047 \h </w:instrText>
           </w:r>
           <w:r>
             <w:fldChar w:fldCharType="separate"/>
@@ -553,7 +553,7 @@
             <w:fldChar w:fldCharType="begin"/>
           </w:r>
           <w:r>
-            <w:instrText xml:space="preserve"> HYPERLINK \l _Toc1473 </w:instrText>
+            <w:instrText xml:space="preserve"> HYPERLINK \l _Toc11182 </w:instrText>
           </w:r>
           <w:r>
             <w:fldChar w:fldCharType="separate"/>
@@ -568,7 +568,7 @@
             <w:fldChar w:fldCharType="begin"/>
           </w:r>
           <w:r>
-            <w:instrText xml:space="preserve"> PAGEREF _Toc1473 \h </w:instrText>
+            <w:instrText xml:space="preserve"> PAGEREF _Toc11182 \h </w:instrText>
           </w:r>
           <w:r>
             <w:fldChar w:fldCharType="separate"/>
@@ -594,7 +594,7 @@
             <w:fldChar w:fldCharType="begin"/>
           </w:r>
           <w:r>
-            <w:instrText xml:space="preserve"> HYPERLINK \l _Toc25057 </w:instrText>
+            <w:instrText xml:space="preserve"> HYPERLINK \l _Toc18673 </w:instrText>
           </w:r>
           <w:r>
             <w:fldChar w:fldCharType="separate"/>
@@ -609,7 +609,7 @@
             <w:fldChar w:fldCharType="begin"/>
           </w:r>
           <w:r>
-            <w:instrText xml:space="preserve"> PAGEREF _Toc25057 \h </w:instrText>
+            <w:instrText xml:space="preserve"> PAGEREF _Toc18673 \h </w:instrText>
           </w:r>
           <w:r>
             <w:fldChar w:fldCharType="separate"/>
@@ -635,7 +635,7 @@
             <w:fldChar w:fldCharType="begin"/>
           </w:r>
           <w:r>
-            <w:instrText xml:space="preserve"> HYPERLINK \l _Toc11540 </w:instrText>
+            <w:instrText xml:space="preserve"> HYPERLINK \l _Toc1687 </w:instrText>
           </w:r>
           <w:r>
             <w:fldChar w:fldCharType="separate"/>
@@ -650,7 +650,7 @@
             <w:fldChar w:fldCharType="begin"/>
           </w:r>
           <w:r>
-            <w:instrText xml:space="preserve"> PAGEREF _Toc11540 \h </w:instrText>
+            <w:instrText xml:space="preserve"> PAGEREF _Toc1687 \h </w:instrText>
           </w:r>
           <w:r>
             <w:fldChar w:fldCharType="separate"/>
@@ -676,7 +676,7 @@
             <w:fldChar w:fldCharType="begin"/>
           </w:r>
           <w:r>
-            <w:instrText xml:space="preserve"> HYPERLINK \l _Toc25206 </w:instrText>
+            <w:instrText xml:space="preserve"> HYPERLINK \l _Toc7751 </w:instrText>
           </w:r>
           <w:r>
             <w:fldChar w:fldCharType="separate"/>
@@ -691,13 +691,13 @@
             <w:fldChar w:fldCharType="begin"/>
           </w:r>
           <w:r>
-            <w:instrText xml:space="preserve"> PAGEREF _Toc25206 \h </w:instrText>
+            <w:instrText xml:space="preserve"> PAGEREF _Toc7751 \h </w:instrText>
           </w:r>
           <w:r>
             <w:fldChar w:fldCharType="separate"/>
           </w:r>
           <w:r>
-            <w:t>6</w:t>
+            <w:t>7</w:t>
           </w:r>
           <w:r>
             <w:fldChar w:fldCharType="end"/>
@@ -717,7 +717,7 @@
             <w:fldChar w:fldCharType="begin"/>
           </w:r>
           <w:r>
-            <w:instrText xml:space="preserve"> HYPERLINK \l _Toc7248 </w:instrText>
+            <w:instrText xml:space="preserve"> HYPERLINK \l _Toc29314 </w:instrText>
           </w:r>
           <w:r>
             <w:fldChar w:fldCharType="separate"/>
@@ -732,7 +732,7 @@
             <w:fldChar w:fldCharType="begin"/>
           </w:r>
           <w:r>
-            <w:instrText xml:space="preserve"> PAGEREF _Toc7248 \h </w:instrText>
+            <w:instrText xml:space="preserve"> PAGEREF _Toc29314 \h </w:instrText>
           </w:r>
           <w:r>
             <w:fldChar w:fldCharType="separate"/>
@@ -758,7 +758,7 @@
             <w:fldChar w:fldCharType="begin"/>
           </w:r>
           <w:r>
-            <w:instrText xml:space="preserve"> HYPERLINK \l _Toc17395 </w:instrText>
+            <w:instrText xml:space="preserve"> HYPERLINK \l _Toc15456 </w:instrText>
           </w:r>
           <w:r>
             <w:fldChar w:fldCharType="separate"/>
@@ -773,7 +773,7 @@
             <w:fldChar w:fldCharType="begin"/>
           </w:r>
           <w:r>
-            <w:instrText xml:space="preserve"> PAGEREF _Toc17395 \h </w:instrText>
+            <w:instrText xml:space="preserve"> PAGEREF _Toc15456 \h </w:instrText>
           </w:r>
           <w:r>
             <w:fldChar w:fldCharType="separate"/>
@@ -799,7 +799,7 @@
             <w:fldChar w:fldCharType="begin"/>
           </w:r>
           <w:r>
-            <w:instrText xml:space="preserve"> HYPERLINK \l _Toc25569 </w:instrText>
+            <w:instrText xml:space="preserve"> HYPERLINK \l _Toc459 </w:instrText>
           </w:r>
           <w:r>
             <w:fldChar w:fldCharType="separate"/>
@@ -814,7 +814,7 @@
             <w:fldChar w:fldCharType="begin"/>
           </w:r>
           <w:r>
-            <w:instrText xml:space="preserve"> PAGEREF _Toc25569 \h </w:instrText>
+            <w:instrText xml:space="preserve"> PAGEREF _Toc459 \h </w:instrText>
           </w:r>
           <w:r>
             <w:fldChar w:fldCharType="separate"/>
@@ -840,7 +840,7 @@
             <w:fldChar w:fldCharType="begin"/>
           </w:r>
           <w:r>
-            <w:instrText xml:space="preserve"> HYPERLINK \l _Toc15425 </w:instrText>
+            <w:instrText xml:space="preserve"> HYPERLINK \l _Toc9318 </w:instrText>
           </w:r>
           <w:r>
             <w:fldChar w:fldCharType="separate"/>
@@ -855,7 +855,7 @@
             <w:fldChar w:fldCharType="begin"/>
           </w:r>
           <w:r>
-            <w:instrText xml:space="preserve"> PAGEREF _Toc15425 \h </w:instrText>
+            <w:instrText xml:space="preserve"> PAGEREF _Toc9318 \h </w:instrText>
           </w:r>
           <w:r>
             <w:fldChar w:fldCharType="separate"/>
@@ -881,7 +881,7 @@
             <w:fldChar w:fldCharType="begin"/>
           </w:r>
           <w:r>
-            <w:instrText xml:space="preserve"> HYPERLINK \l _Toc21654 </w:instrText>
+            <w:instrText xml:space="preserve"> HYPERLINK \l _Toc4143 </w:instrText>
           </w:r>
           <w:r>
             <w:fldChar w:fldCharType="separate"/>
@@ -896,7 +896,7 @@
             <w:fldChar w:fldCharType="begin"/>
           </w:r>
           <w:r>
-            <w:instrText xml:space="preserve"> PAGEREF _Toc21654 \h </w:instrText>
+            <w:instrText xml:space="preserve"> PAGEREF _Toc4143 \h </w:instrText>
           </w:r>
           <w:r>
             <w:fldChar w:fldCharType="separate"/>
@@ -922,7 +922,7 @@
             <w:fldChar w:fldCharType="begin"/>
           </w:r>
           <w:r>
-            <w:instrText xml:space="preserve"> HYPERLINK \l _Toc2414 </w:instrText>
+            <w:instrText xml:space="preserve"> HYPERLINK \l _Toc3452 </w:instrText>
           </w:r>
           <w:r>
             <w:fldChar w:fldCharType="separate"/>
@@ -937,7 +937,7 @@
             <w:fldChar w:fldCharType="begin"/>
           </w:r>
           <w:r>
-            <w:instrText xml:space="preserve"> PAGEREF _Toc2414 \h </w:instrText>
+            <w:instrText xml:space="preserve"> PAGEREF _Toc3452 \h </w:instrText>
           </w:r>
           <w:r>
             <w:fldChar w:fldCharType="separate"/>
@@ -963,7 +963,7 @@
             <w:fldChar w:fldCharType="begin"/>
           </w:r>
           <w:r>
-            <w:instrText xml:space="preserve"> HYPERLINK \l _Toc2766 </w:instrText>
+            <w:instrText xml:space="preserve"> HYPERLINK \l _Toc24909 </w:instrText>
           </w:r>
           <w:r>
             <w:fldChar w:fldCharType="separate"/>
@@ -978,7 +978,7 @@
             <w:fldChar w:fldCharType="begin"/>
           </w:r>
           <w:r>
-            <w:instrText xml:space="preserve"> PAGEREF _Toc2766 \h </w:instrText>
+            <w:instrText xml:space="preserve"> PAGEREF _Toc24909 \h </w:instrText>
           </w:r>
           <w:r>
             <w:fldChar w:fldCharType="separate"/>
@@ -1004,7 +1004,7 @@
             <w:fldChar w:fldCharType="begin"/>
           </w:r>
           <w:r>
-            <w:instrText xml:space="preserve"> HYPERLINK \l _Toc6821 </w:instrText>
+            <w:instrText xml:space="preserve"> HYPERLINK \l _Toc6558 </w:instrText>
           </w:r>
           <w:r>
             <w:fldChar w:fldCharType="separate"/>
@@ -1019,7 +1019,7 @@
             <w:fldChar w:fldCharType="begin"/>
           </w:r>
           <w:r>
-            <w:instrText xml:space="preserve"> PAGEREF _Toc6821 \h </w:instrText>
+            <w:instrText xml:space="preserve"> PAGEREF _Toc6558 \h </w:instrText>
           </w:r>
           <w:r>
             <w:fldChar w:fldCharType="separate"/>
@@ -1045,7 +1045,7 @@
             <w:fldChar w:fldCharType="begin"/>
           </w:r>
           <w:r>
-            <w:instrText xml:space="preserve"> HYPERLINK \l _Toc5170 </w:instrText>
+            <w:instrText xml:space="preserve"> HYPERLINK \l _Toc20619 </w:instrText>
           </w:r>
           <w:r>
             <w:fldChar w:fldCharType="separate"/>
@@ -1060,7 +1060,7 @@
             <w:fldChar w:fldCharType="begin"/>
           </w:r>
           <w:r>
-            <w:instrText xml:space="preserve"> PAGEREF _Toc5170 \h </w:instrText>
+            <w:instrText xml:space="preserve"> PAGEREF _Toc20619 \h </w:instrText>
           </w:r>
           <w:r>
             <w:fldChar w:fldCharType="separate"/>
@@ -1086,7 +1086,7 @@
             <w:fldChar w:fldCharType="begin"/>
           </w:r>
           <w:r>
-            <w:instrText xml:space="preserve"> HYPERLINK \l _Toc15747 </w:instrText>
+            <w:instrText xml:space="preserve"> HYPERLINK \l _Toc23187 </w:instrText>
           </w:r>
           <w:r>
             <w:fldChar w:fldCharType="separate"/>
@@ -1101,7 +1101,7 @@
             <w:fldChar w:fldCharType="begin"/>
           </w:r>
           <w:r>
-            <w:instrText xml:space="preserve"> PAGEREF _Toc15747 \h </w:instrText>
+            <w:instrText xml:space="preserve"> PAGEREF _Toc23187 \h </w:instrText>
           </w:r>
           <w:r>
             <w:fldChar w:fldCharType="separate"/>
@@ -1127,7 +1127,7 @@
             <w:fldChar w:fldCharType="begin"/>
           </w:r>
           <w:r>
-            <w:instrText xml:space="preserve"> HYPERLINK \l _Toc3094 </w:instrText>
+            <w:instrText xml:space="preserve"> HYPERLINK \l _Toc1220 </w:instrText>
           </w:r>
           <w:r>
             <w:fldChar w:fldCharType="separate"/>
@@ -1142,13 +1142,13 @@
             <w:fldChar w:fldCharType="begin"/>
           </w:r>
           <w:r>
-            <w:instrText xml:space="preserve"> PAGEREF _Toc3094 \h </w:instrText>
+            <w:instrText xml:space="preserve"> PAGEREF _Toc1220 \h </w:instrText>
           </w:r>
           <w:r>
             <w:fldChar w:fldCharType="separate"/>
           </w:r>
           <w:r>
-            <w:t>9</w:t>
+            <w:t>10</w:t>
           </w:r>
           <w:r>
             <w:fldChar w:fldCharType="end"/>
@@ -1168,7 +1168,7 @@
             <w:fldChar w:fldCharType="begin"/>
           </w:r>
           <w:r>
-            <w:instrText xml:space="preserve"> HYPERLINK \l _Toc23416 </w:instrText>
+            <w:instrText xml:space="preserve"> HYPERLINK \l _Toc28490 </w:instrText>
           </w:r>
           <w:r>
             <w:fldChar w:fldCharType="separate"/>
@@ -1183,7 +1183,7 @@
             <w:fldChar w:fldCharType="begin"/>
           </w:r>
           <w:r>
-            <w:instrText xml:space="preserve"> PAGEREF _Toc23416 \h </w:instrText>
+            <w:instrText xml:space="preserve"> PAGEREF _Toc28490 \h </w:instrText>
           </w:r>
           <w:r>
             <w:fldChar w:fldCharType="separate"/>
@@ -1209,7 +1209,7 @@
             <w:fldChar w:fldCharType="begin"/>
           </w:r>
           <w:r>
-            <w:instrText xml:space="preserve"> HYPERLINK \l _Toc11249 </w:instrText>
+            <w:instrText xml:space="preserve"> HYPERLINK \l _Toc28317 </w:instrText>
           </w:r>
           <w:r>
             <w:fldChar w:fldCharType="separate"/>
@@ -1224,7 +1224,7 @@
             <w:fldChar w:fldCharType="begin"/>
           </w:r>
           <w:r>
-            <w:instrText xml:space="preserve"> PAGEREF _Toc11249 \h </w:instrText>
+            <w:instrText xml:space="preserve"> PAGEREF _Toc28317 \h </w:instrText>
           </w:r>
           <w:r>
             <w:fldChar w:fldCharType="separate"/>
@@ -1250,7 +1250,7 @@
             <w:fldChar w:fldCharType="begin"/>
           </w:r>
           <w:r>
-            <w:instrText xml:space="preserve"> HYPERLINK \l _Toc28378 </w:instrText>
+            <w:instrText xml:space="preserve"> HYPERLINK \l _Toc1377 </w:instrText>
           </w:r>
           <w:r>
             <w:fldChar w:fldCharType="separate"/>
@@ -1265,13 +1265,13 @@
             <w:fldChar w:fldCharType="begin"/>
           </w:r>
           <w:r>
-            <w:instrText xml:space="preserve"> PAGEREF _Toc28378 \h </w:instrText>
+            <w:instrText xml:space="preserve"> PAGEREF _Toc1377 \h </w:instrText>
           </w:r>
           <w:r>
             <w:fldChar w:fldCharType="separate"/>
           </w:r>
           <w:r>
-            <w:t>10</w:t>
+            <w:t>11</w:t>
           </w:r>
           <w:r>
             <w:fldChar w:fldCharType="end"/>
@@ -1296,7 +1296,7 @@
       <w:pPr>
         <w:pStyle w:val="2"/>
       </w:pPr>
-      <w:bookmarkStart w:id="0" w:name="_Toc29762"/>
+      <w:bookmarkStart w:id="0" w:name="_Toc31718"/>
       <w:r>
         <w:t>1. 项目概述</w:t>
       </w:r>
@@ -1366,7 +1366,7 @@
       <w:pPr>
         <w:pStyle w:val="3"/>
       </w:pPr>
-      <w:bookmarkStart w:id="1" w:name="_Toc1392"/>
+      <w:bookmarkStart w:id="1" w:name="_Toc17159"/>
       <w:r>
         <w:t>1.1 当前实现状态</w:t>
       </w:r>
@@ -2319,7 +2319,7 @@
       <w:pPr>
         <w:pStyle w:val="2"/>
       </w:pPr>
-      <w:bookmarkStart w:id="2" w:name="_Toc275"/>
+      <w:bookmarkStart w:id="2" w:name="_Toc18546"/>
       <w:r>
         <w:t>2. 范围与合规边界（必读）</w:t>
       </w:r>
@@ -2329,7 +2329,7 @@
       <w:pPr>
         <w:pStyle w:val="3"/>
       </w:pPr>
-      <w:bookmarkStart w:id="3" w:name="_Toc1749"/>
+      <w:bookmarkStart w:id="3" w:name="_Toc30522"/>
       <w:r>
         <w:t>2.1 范围内</w:t>
       </w:r>
@@ -2391,7 +2391,7 @@
       <w:pPr>
         <w:pStyle w:val="3"/>
       </w:pPr>
-      <w:bookmarkStart w:id="4" w:name="_Toc14586"/>
+      <w:bookmarkStart w:id="4" w:name="_Toc32632"/>
       <w:r>
         <w:t>2.2 红线</w:t>
       </w:r>
@@ -2440,7 +2440,7 @@
       <w:pPr>
         <w:pStyle w:val="2"/>
       </w:pPr>
-      <w:bookmarkStart w:id="5" w:name="_Toc4092"/>
+      <w:bookmarkStart w:id="5" w:name="_Toc29675"/>
       <w:r>
         <w:t>3. 核心指标定义</w:t>
       </w:r>
@@ -3136,7 +3136,7 @@
       <w:pPr>
         <w:pStyle w:val="2"/>
       </w:pPr>
-      <w:bookmarkStart w:id="6" w:name="_Toc23443"/>
+      <w:bookmarkStart w:id="6" w:name="_Toc20025"/>
       <w:r>
         <w:t>4. 功能需求</w:t>
       </w:r>
@@ -3146,7 +3146,7 @@
       <w:pPr>
         <w:pStyle w:val="3"/>
       </w:pPr>
-      <w:bookmarkStart w:id="7" w:name="_Toc31787"/>
+      <w:bookmarkStart w:id="7" w:name="_Toc15053"/>
       <w:r>
         <w:t>4.1 实时监控页（✅ 已实现）</w:t>
       </w:r>
@@ -3162,7 +3162,7 @@
         <w:spacing w:after="60" w:line="300" w:lineRule="auto"/>
       </w:pPr>
       <w:r>
-        <w:t>综合榜 + 分平台榜：平台 Tab（综合/YouTube/Reddit/Hacker News/Google News/TMDb/Giphy）。</w:t>
+        <w:t>综合榜 + 分平台榜：平台 Tab（综合/YouTube/Reddit/Hacker News/Google News/TMDb/Giphy/TikTok/Facebook）。TikTok/Facebook 已就绪,真实数据 TikTok 需第三方、Facebook 以广告资料库为主(见 §6.2)。</w:t>
       </w:r>
     </w:p>
     <w:p>
@@ -3338,7 +3338,7 @@
       <w:pPr>
         <w:pStyle w:val="3"/>
       </w:pPr>
-      <w:bookmarkStart w:id="8" w:name="_Toc28859"/>
+      <w:bookmarkStart w:id="8" w:name="_Toc23365"/>
       <w:r>
         <w:t>4.2 月度汇总页（✅ 已实现）</w:t>
       </w:r>
@@ -3400,7 +3400,7 @@
       <w:pPr>
         <w:pStyle w:val="3"/>
       </w:pPr>
-      <w:bookmarkStart w:id="9" w:name="_Toc11955"/>
+      <w:bookmarkStart w:id="9" w:name="_Toc32047"/>
       <w:r>
         <w:t>4.3 广告情报页（✅ 已实现）</w:t>
       </w:r>
@@ -3449,7 +3449,7 @@
       <w:pPr>
         <w:pStyle w:val="3"/>
       </w:pPr>
-      <w:bookmarkStart w:id="10" w:name="_Toc1473"/>
+      <w:bookmarkStart w:id="10" w:name="_Toc11182"/>
       <w:r>
         <w:t>4.4 通用 / 体验（✅ 已实现）</w:t>
       </w:r>
@@ -3511,7 +3511,7 @@
       <w:pPr>
         <w:pStyle w:val="3"/>
       </w:pPr>
-      <w:bookmarkStart w:id="11" w:name="_Toc25057"/>
+      <w:bookmarkStart w:id="11" w:name="_Toc18673"/>
       <w:r>
         <w:t>4.5 待建（后端 / 扩展）</w:t>
       </w:r>
@@ -3599,7 +3599,7 @@
       <w:pPr>
         <w:pStyle w:val="2"/>
       </w:pPr>
-      <w:bookmarkStart w:id="12" w:name="_Toc11540"/>
+      <w:bookmarkStart w:id="12" w:name="_Toc1687"/>
       <w:r>
         <w:t>5. 接口契约（前后端对接）</w:t>
       </w:r>
@@ -3617,7 +3617,7 @@
       <w:pPr>
         <w:pStyle w:val="3"/>
       </w:pPr>
-      <w:bookmarkStart w:id="13" w:name="_Toc25206"/>
+      <w:bookmarkStart w:id="13" w:name="_Toc7751"/>
       <w:r>
         <w:t>5.1 GET /trends — 实时热点榜</w:t>
       </w:r>
@@ -3797,7 +3797,7 @@
       <w:pPr>
         <w:pStyle w:val="3"/>
       </w:pPr>
-      <w:bookmarkStart w:id="14" w:name="_Toc7248"/>
+      <w:bookmarkStart w:id="14" w:name="_Toc29314"/>
       <w:r>
         <w:t>5.2 GET /monthly?month=YYYY-MM — 月度汇总</w:t>
       </w:r>
@@ -3815,7 +3815,7 @@
       <w:pPr>
         <w:pStyle w:val="3"/>
       </w:pPr>
-      <w:bookmarkStart w:id="15" w:name="_Toc17395"/>
+      <w:bookmarkStart w:id="15" w:name="_Toc15456"/>
       <w:r>
         <w:t>5.3 GET /ads?q=&amp;category=&amp;region= — 广告情报</w:t>
       </w:r>
@@ -3943,7 +3943,7 @@
       <w:pPr>
         <w:pStyle w:val="3"/>
       </w:pPr>
-      <w:bookmarkStart w:id="16" w:name="_Toc25569"/>
+      <w:bookmarkStart w:id="16" w:name="_Toc459"/>
       <w:r>
         <w:t>5.4 TrendItem 数据结构</w:t>
       </w:r>
@@ -4253,7 +4253,7 @@
       <w:pPr>
         <w:pStyle w:val="3"/>
       </w:pPr>
-      <w:bookmarkStart w:id="17" w:name="_Toc15425"/>
+      <w:bookmarkStart w:id="17" w:name="_Toc9318"/>
       <w:r>
         <w:t>5.5 AdItem 数据结构</w:t>
       </w:r>
@@ -4519,7 +4519,7 @@
       <w:pPr>
         <w:pStyle w:val="2"/>
       </w:pPr>
-      <w:bookmarkStart w:id="18" w:name="_Toc21654"/>
+      <w:bookmarkStart w:id="18" w:name="_Toc4143"/>
       <w:r>
         <w:t>6. 外部数据源 API 清单（后端采集需申请）</w:t>
       </w:r>
@@ -4529,7 +4529,7 @@
       <w:pPr>
         <w:pStyle w:val="3"/>
       </w:pPr>
-      <w:bookmarkStart w:id="19" w:name="_Toc2414"/>
+      <w:bookmarkStart w:id="19" w:name="_Toc3452"/>
       <w:r>
         <w:t>6.1 MVP 必须（A 档，对应看板 6 个平台 Tab）</w:t>
       </w:r>
@@ -5855,7 +5855,7 @@
       <w:pPr>
         <w:pStyle w:val="3"/>
       </w:pPr>
-      <w:bookmarkStart w:id="20" w:name="_Toc2766"/>
+      <w:bookmarkStart w:id="20" w:name="_Toc24909"/>
       <w:r>
         <w:t>6.2 广告情报 &amp; 扩展（B/C 档）</w:t>
       </w:r>
@@ -5884,7 +5884,7 @@
         <w:spacing w:after="60" w:line="300" w:lineRule="auto"/>
       </w:pPr>
       <w:r>
-        <w:t>Tenor、Imgflip（梗图，免费/免 key）。</w:t>
+        <w:t>TikTok（前端已就绪）：官方无公开热点 API，真实公开热点数据须走第三方数据商（如 Tikapi 等）。</w:t>
       </w:r>
     </w:p>
     <w:p>
@@ -5897,14 +5897,40 @@
         <w:spacing w:after="60" w:line="300" w:lineRule="auto"/>
       </w:pPr>
       <w:r>
-        <w:t>X/Twitter（API v2，按量付费，慎用）、Pinterest、TikTok（无官方公开 API，需第三方）。</w:t>
+        <w:t>Facebook（前端已就绪）：自然内容无官方热榜 API，FB 侧公开数据以广告资料库为主。</w:t>
+      </w:r>
+    </w:p>
+    <w:p>
+      <w:pPr>
+        <w:pStyle w:val="18"/>
+        <w:numPr>
+          <w:ilvl w:val="0"/>
+          <w:numId w:val="2"/>
+        </w:numPr>
+        <w:spacing w:after="60" w:line="300" w:lineRule="auto"/>
+      </w:pPr>
+      <w:r>
+        <w:t>Tenor、Imgflip（梗图，免费/免 key）。</w:t>
+      </w:r>
+    </w:p>
+    <w:p>
+      <w:pPr>
+        <w:pStyle w:val="18"/>
+        <w:numPr>
+          <w:ilvl w:val="0"/>
+          <w:numId w:val="2"/>
+        </w:numPr>
+        <w:spacing w:after="60" w:line="300" w:lineRule="auto"/>
+      </w:pPr>
+      <w:r>
+        <w:t>X/Twitter（API v2，按量付费，慎用）、Pinterest。</w:t>
       </w:r>
     </w:p>
     <w:p>
       <w:pPr>
         <w:pStyle w:val="3"/>
       </w:pPr>
-      <w:bookmarkStart w:id="21" w:name="_Toc6821"/>
+      <w:bookmarkStart w:id="21" w:name="_Toc6558"/>
       <w:r>
         <w:t>6.3 密钥管理</w:t>
       </w:r>
@@ -5922,7 +5948,7 @@
       <w:pPr>
         <w:pStyle w:val="2"/>
       </w:pPr>
-      <w:bookmarkStart w:id="22" w:name="_Toc5170"/>
+      <w:bookmarkStart w:id="22" w:name="_Toc20619"/>
       <w:r>
         <w:t>7. 关键实现要点（非 API，但必须）</w:t>
       </w:r>
@@ -5984,7 +6010,7 @@
       <w:pPr>
         <w:pStyle w:val="2"/>
       </w:pPr>
-      <w:bookmarkStart w:id="23" w:name="_Toc15747"/>
+      <w:bookmarkStart w:id="23" w:name="_Toc23187"/>
       <w:r>
         <w:t>8. 非功能需求</w:t>
       </w:r>
@@ -6059,7 +6085,7 @@
       <w:pPr>
         <w:pStyle w:val="2"/>
       </w:pPr>
-      <w:bookmarkStart w:id="24" w:name="_Toc3094"/>
+      <w:bookmarkStart w:id="24" w:name="_Toc1220"/>
       <w:r>
         <w:t>9. 部署与运维（✅ 前端已上线）</w:t>
       </w:r>
@@ -6134,7 +6160,7 @@
       <w:pPr>
         <w:pStyle w:val="2"/>
       </w:pPr>
-      <w:bookmarkStart w:id="25" w:name="_Toc23416"/>
+      <w:bookmarkStart w:id="25" w:name="_Toc28490"/>
       <w:r>
         <w:t>10. 里程碑</w:t>
       </w:r>
@@ -6678,7 +6704,7 @@
       <w:pPr>
         <w:pStyle w:val="2"/>
       </w:pPr>
-      <w:bookmarkStart w:id="26" w:name="_Toc11249"/>
+      <w:bookmarkStart w:id="26" w:name="_Toc28317"/>
       <w:r>
         <w:t>11. 交付物</w:t>
       </w:r>
@@ -6753,7 +6779,7 @@
       <w:pPr>
         <w:pStyle w:val="2"/>
       </w:pPr>
-      <w:bookmarkStart w:id="27" w:name="_Toc28378"/>
+      <w:bookmarkStart w:id="27" w:name="_Toc1377"/>
       <w:r>
         <w:t>12. 验收标准</w:t>
       </w:r>
@@ -6984,9 +7010,23 @@
 <file path=word/numbering.xml><?xml version="1.0" encoding="utf-8"?>
 <w:numbering xmlns:wpc="http://schemas.microsoft.com/office/word/2010/wordprocessingCanvas" xmlns:mc="http://schemas.openxmlformats.org/markup-compatibility/2006" xmlns:o="urn:schemas-microsoft-com:office:office" xmlns:r="http://schemas.openxmlformats.org/officeDocument/2006/relationships" xmlns:m="http://schemas.openxmlformats.org/officeDocument/2006/math" xmlns:v="urn:schemas-microsoft-com:vml" xmlns:wp14="http://schemas.microsoft.com/office/word/2010/wordprocessingDrawing" xmlns:wp="http://schemas.openxmlformats.org/drawingml/2006/wordprocessingDrawing" xmlns:w10="urn:schemas-microsoft-com:office:word" xmlns:w="http://schemas.openxmlformats.org/wordprocessingml/2006/main" xmlns:w14="http://schemas.microsoft.com/office/word/2010/wordml" xmlns:wpg="http://schemas.microsoft.com/office/word/2010/wordprocessingGroup" xmlns:wpi="http://schemas.microsoft.com/office/word/2010/wordprocessingInk" xmlns:wne="http://schemas.microsoft.com/office/word/2006/wordml" xmlns:wps="http://schemas.microsoft.com/office/word/2010/wordprocessingShape" xmlns:wpsCustomData="http://www.wps.cn/officeDocument/2013/wpsCustomData" mc:Ignorable="w14 wp14">
   <w:abstractNum w:abstractNumId="0">
-    <w:nsid w:val="F857C2EF"/>
+    <w:nsid w:val="860F21CA"/>
     <w:multiLevelType w:val="singleLevel"/>
-    <w:tmpl w:val="F857C2EF"/>
+    <w:tmpl w:val="860F21CA"/>
+    <w:lvl w:ilvl="0" w:tentative="0">
+      <w:start w:val="1"/>
+      <w:numFmt w:val="decimal"/>
+      <w:lvlText w:val="%1."/>
+      <w:lvlJc w:val="left"/>
+      <w:pPr>
+        <w:ind w:left="480" w:hanging="280"/>
+      </w:pPr>
+    </w:lvl>
+  </w:abstractNum>
+  <w:abstractNum w:abstractNumId="1">
+    <w:nsid w:val="759B6D17"/>
+    <w:multiLevelType w:val="singleLevel"/>
+    <w:tmpl w:val="759B6D17"/>
     <w:lvl w:ilvl="0" w:tentative="0">
       <w:start w:val="1"/>
       <w:numFmt w:val="bullet"/>
@@ -6997,28 +7037,14 @@
       </w:pPr>
     </w:lvl>
   </w:abstractNum>
-  <w:abstractNum w:abstractNumId="1">
-    <w:nsid w:val="0AE0044D"/>
-    <w:multiLevelType w:val="singleLevel"/>
-    <w:tmpl w:val="0AE0044D"/>
-    <w:lvl w:ilvl="0" w:tentative="0">
-      <w:start w:val="1"/>
-      <w:numFmt w:val="decimal"/>
-      <w:lvlText w:val="%1."/>
-      <w:lvlJc w:val="left"/>
-      <w:pPr>
-        <w:ind w:left="480" w:hanging="280"/>
-      </w:pPr>
-    </w:lvl>
-  </w:abstractNum>
   <w:num w:numId="1">
-    <w:abstractNumId w:val="1"/>
+    <w:abstractNumId w:val="0"/>
     <w:lvlOverride w:ilvl="0">
       <w:startOverride w:val="1"/>
     </w:lvlOverride>
   </w:num>
   <w:num w:numId="2">
-    <w:abstractNumId w:val="0"/>
+    <w:abstractNumId w:val="1"/>
     <w:lvlOverride w:ilvl="0">
       <w:startOverride w:val="1"/>
     </w:lvlOverride>
@@ -7066,7 +7092,7 @@
     <w:lsdException w:unhideWhenUsed="0" w:uiPriority="0" w:semiHidden="0" w:name="toc 8"/>
     <w:lsdException w:unhideWhenUsed="0" w:uiPriority="0" w:semiHidden="0" w:name="toc 9"/>
     <w:lsdException w:unhideWhenUsed="0" w:uiPriority="0" w:semiHidden="0" w:name="Normal Indent"/>
-    <w:lsdException w:qFormat="1" w:uiPriority="99" w:name="footnote text"/>
+    <w:lsdException w:uiPriority="99" w:name="footnote text"/>
     <w:lsdException w:unhideWhenUsed="0" w:uiPriority="0" w:semiHidden="0" w:name="annotation text"/>
     <w:lsdException w:unhideWhenUsed="0" w:uiPriority="0" w:semiHidden="0" w:name="header"/>
     <w:lsdException w:unhideWhenUsed="0" w:uiPriority="0" w:semiHidden="0" w:name="footer"/>
@@ -7075,12 +7101,12 @@
     <w:lsdException w:unhideWhenUsed="0" w:uiPriority="0" w:semiHidden="0" w:name="table of figures"/>
     <w:lsdException w:unhideWhenUsed="0" w:uiPriority="0" w:semiHidden="0" w:name="envelope address"/>
     <w:lsdException w:unhideWhenUsed="0" w:uiPriority="0" w:semiHidden="0" w:name="envelope return"/>
-    <w:lsdException w:qFormat="1" w:uiPriority="99" w:name="footnote reference"/>
+    <w:lsdException w:uiPriority="99" w:name="footnote reference"/>
     <w:lsdException w:unhideWhenUsed="0" w:uiPriority="0" w:semiHidden="0" w:name="annotation reference"/>
     <w:lsdException w:unhideWhenUsed="0" w:uiPriority="0" w:semiHidden="0" w:name="line number"/>
     <w:lsdException w:unhideWhenUsed="0" w:uiPriority="0" w:semiHidden="0" w:name="page number"/>
-    <w:lsdException w:qFormat="1" w:uiPriority="99" w:name="endnote reference"/>
-    <w:lsdException w:qFormat="1" w:uiPriority="99" w:name="endnote text"/>
+    <w:lsdException w:uiPriority="99" w:name="endnote reference"/>
+    <w:lsdException w:uiPriority="99" w:name="endnote text"/>
     <w:lsdException w:unhideWhenUsed="0" w:uiPriority="0" w:semiHidden="0" w:name="table of authorities"/>
     <w:lsdException w:unhideWhenUsed="0" w:uiPriority="0" w:semiHidden="0" w:name="macro"/>
     <w:lsdException w:unhideWhenUsed="0" w:uiPriority="0" w:semiHidden="0" w:name="toa heading"/>
@@ -7122,7 +7148,7 @@
     <w:lsdException w:unhideWhenUsed="0" w:uiPriority="0" w:semiHidden="0" w:name="Body Text Indent 2"/>
     <w:lsdException w:unhideWhenUsed="0" w:uiPriority="0" w:semiHidden="0" w:name="Body Text Indent 3"/>
     <w:lsdException w:unhideWhenUsed="0" w:uiPriority="0" w:semiHidden="0" w:name="Block Text"/>
-    <w:lsdException w:qFormat="1" w:uiPriority="99" w:semiHidden="0" w:name="Hyperlink"/>
+    <w:lsdException w:uiPriority="99" w:semiHidden="0" w:name="Hyperlink"/>
     <w:lsdException w:unhideWhenUsed="0" w:uiPriority="0" w:semiHidden="0" w:name="FollowedHyperlink"/>
     <w:lsdException w:qFormat="1" w:unhideWhenUsed="0" w:uiPriority="0" w:semiHidden="0" w:name="Strong"/>
     <w:lsdException w:qFormat="1" w:unhideWhenUsed="0" w:uiPriority="0" w:semiHidden="0" w:name="Emphasis"/>
@@ -7410,7 +7436,6 @@
     <w:link w:val="20"/>
     <w:semiHidden/>
     <w:unhideWhenUsed/>
-    <w:qFormat/>
     <w:uiPriority w:val="99"/>
     <w:pPr>
       <w:spacing w:after="0" w:line="240" w:lineRule="auto"/>
@@ -7432,7 +7457,6 @@
     <w:link w:val="19"/>
     <w:semiHidden/>
     <w:unhideWhenUsed/>
-    <w:qFormat/>
     <w:uiPriority w:val="99"/>
     <w:pPr>
       <w:spacing w:after="0" w:line="240" w:lineRule="auto"/>
@@ -7466,7 +7490,6 @@
     <w:name w:val="endnote reference"/>
     <w:semiHidden/>
     <w:unhideWhenUsed/>
-    <w:qFormat/>
     <w:uiPriority w:val="99"/>
     <w:rPr>
       <w:vertAlign w:val="superscript"/>
@@ -7475,7 +7498,6 @@
   <w:style w:type="character" w:styleId="16">
     <w:name w:val="Hyperlink"/>
     <w:unhideWhenUsed/>
-    <w:qFormat/>
     <w:uiPriority w:val="99"/>
     <w:rPr>
       <w:color w:val="0563C1"/>
@@ -7486,7 +7508,6 @@
     <w:name w:val="footnote reference"/>
     <w:semiHidden/>
     <w:unhideWhenUsed/>
-    <w:qFormat/>
     <w:uiPriority w:val="99"/>
     <w:rPr>
       <w:vertAlign w:val="superscript"/>
@@ -7507,7 +7528,6 @@
     <w:link w:val="10"/>
     <w:semiHidden/>
     <w:unhideWhenUsed/>
-    <w:qFormat/>
     <w:uiPriority w:val="99"/>
     <w:rPr>
       <w:sz w:val="20"/>
@@ -7519,7 +7539,6 @@
     <w:link w:val="8"/>
     <w:semiHidden/>
     <w:unhideWhenUsed/>
-    <w:qFormat/>
     <w:uiPriority w:val="99"/>
     <w:rPr>
       <w:sz w:val="20"/>

</xml_diff>

<commit_message>
docs: TikTok 数据源更正为官方 Creative Center(Trends)
- 经探测确认 creative_radar_api 接口可达,需匿名令牌握手
- 更新代码注释与需求文档 §6.2:优先用官方免费 Creative Center,
  后端经令牌握手调 API 或无头渲染;第三方数据商降为备选

Co-Authored-By: Claude Opus 4.8 <noreply@anthropic.com>
</commit_message>
<xml_diff>
--- a/docs/平台需求文档.docx
+++ b/docs/平台需求文档.docx
@@ -111,7 +111,7 @@
     <w:sdt>
       <w:sdtPr>
         <w:alias w:val="Table of Contents"/>
-        <w:id w:val="147451929"/>
+        <w:id w:val="147483511"/>
       </w:sdtPr>
       <w:sdtContent>
         <w:p>
@@ -143,7 +143,7 @@
             <w:fldChar w:fldCharType="begin"/>
           </w:r>
           <w:r>
-            <w:instrText xml:space="preserve"> HYPERLINK \l _Toc31718 </w:instrText>
+            <w:instrText xml:space="preserve"> HYPERLINK \l _Toc136 </w:instrText>
           </w:r>
           <w:r>
             <w:fldChar w:fldCharType="separate"/>
@@ -158,7 +158,7 @@
             <w:fldChar w:fldCharType="begin"/>
           </w:r>
           <w:r>
-            <w:instrText xml:space="preserve"> PAGEREF _Toc31718 \h </w:instrText>
+            <w:instrText xml:space="preserve"> PAGEREF _Toc136 \h </w:instrText>
           </w:r>
           <w:r>
             <w:fldChar w:fldCharType="separate"/>
@@ -184,7 +184,7 @@
             <w:fldChar w:fldCharType="begin"/>
           </w:r>
           <w:r>
-            <w:instrText xml:space="preserve"> HYPERLINK \l _Toc17159 </w:instrText>
+            <w:instrText xml:space="preserve"> HYPERLINK \l _Toc19439 </w:instrText>
           </w:r>
           <w:r>
             <w:fldChar w:fldCharType="separate"/>
@@ -199,7 +199,7 @@
             <w:fldChar w:fldCharType="begin"/>
           </w:r>
           <w:r>
-            <w:instrText xml:space="preserve"> PAGEREF _Toc17159 \h </w:instrText>
+            <w:instrText xml:space="preserve"> PAGEREF _Toc19439 \h </w:instrText>
           </w:r>
           <w:r>
             <w:fldChar w:fldCharType="separate"/>
@@ -225,7 +225,7 @@
             <w:fldChar w:fldCharType="begin"/>
           </w:r>
           <w:r>
-            <w:instrText xml:space="preserve"> HYPERLINK \l _Toc18546 </w:instrText>
+            <w:instrText xml:space="preserve"> HYPERLINK \l _Toc15176 </w:instrText>
           </w:r>
           <w:r>
             <w:fldChar w:fldCharType="separate"/>
@@ -240,7 +240,7 @@
             <w:fldChar w:fldCharType="begin"/>
           </w:r>
           <w:r>
-            <w:instrText xml:space="preserve"> PAGEREF _Toc18546 \h </w:instrText>
+            <w:instrText xml:space="preserve"> PAGEREF _Toc15176 \h </w:instrText>
           </w:r>
           <w:r>
             <w:fldChar w:fldCharType="separate"/>
@@ -266,7 +266,7 @@
             <w:fldChar w:fldCharType="begin"/>
           </w:r>
           <w:r>
-            <w:instrText xml:space="preserve"> HYPERLINK \l _Toc30522 </w:instrText>
+            <w:instrText xml:space="preserve"> HYPERLINK \l _Toc16449 </w:instrText>
           </w:r>
           <w:r>
             <w:fldChar w:fldCharType="separate"/>
@@ -281,7 +281,7 @@
             <w:fldChar w:fldCharType="begin"/>
           </w:r>
           <w:r>
-            <w:instrText xml:space="preserve"> PAGEREF _Toc30522 \h </w:instrText>
+            <w:instrText xml:space="preserve"> PAGEREF _Toc16449 \h </w:instrText>
           </w:r>
           <w:r>
             <w:fldChar w:fldCharType="separate"/>
@@ -307,7 +307,7 @@
             <w:fldChar w:fldCharType="begin"/>
           </w:r>
           <w:r>
-            <w:instrText xml:space="preserve"> HYPERLINK \l _Toc32632 </w:instrText>
+            <w:instrText xml:space="preserve"> HYPERLINK \l _Toc8503 </w:instrText>
           </w:r>
           <w:r>
             <w:fldChar w:fldCharType="separate"/>
@@ -322,7 +322,7 @@
             <w:fldChar w:fldCharType="begin"/>
           </w:r>
           <w:r>
-            <w:instrText xml:space="preserve"> PAGEREF _Toc32632 \h </w:instrText>
+            <w:instrText xml:space="preserve"> PAGEREF _Toc8503 \h </w:instrText>
           </w:r>
           <w:r>
             <w:fldChar w:fldCharType="separate"/>
@@ -348,7 +348,7 @@
             <w:fldChar w:fldCharType="begin"/>
           </w:r>
           <w:r>
-            <w:instrText xml:space="preserve"> HYPERLINK \l _Toc29675 </w:instrText>
+            <w:instrText xml:space="preserve"> HYPERLINK \l _Toc13286 </w:instrText>
           </w:r>
           <w:r>
             <w:fldChar w:fldCharType="separate"/>
@@ -363,7 +363,7 @@
             <w:fldChar w:fldCharType="begin"/>
           </w:r>
           <w:r>
-            <w:instrText xml:space="preserve"> PAGEREF _Toc29675 \h </w:instrText>
+            <w:instrText xml:space="preserve"> PAGEREF _Toc13286 \h </w:instrText>
           </w:r>
           <w:r>
             <w:fldChar w:fldCharType="separate"/>
@@ -389,7 +389,7 @@
             <w:fldChar w:fldCharType="begin"/>
           </w:r>
           <w:r>
-            <w:instrText xml:space="preserve"> HYPERLINK \l _Toc20025 </w:instrText>
+            <w:instrText xml:space="preserve"> HYPERLINK \l _Toc2965 </w:instrText>
           </w:r>
           <w:r>
             <w:fldChar w:fldCharType="separate"/>
@@ -404,7 +404,7 @@
             <w:fldChar w:fldCharType="begin"/>
           </w:r>
           <w:r>
-            <w:instrText xml:space="preserve"> PAGEREF _Toc20025 \h </w:instrText>
+            <w:instrText xml:space="preserve"> PAGEREF _Toc2965 \h </w:instrText>
           </w:r>
           <w:r>
             <w:fldChar w:fldCharType="separate"/>
@@ -430,7 +430,7 @@
             <w:fldChar w:fldCharType="begin"/>
           </w:r>
           <w:r>
-            <w:instrText xml:space="preserve"> HYPERLINK \l _Toc15053 </w:instrText>
+            <w:instrText xml:space="preserve"> HYPERLINK \l _Toc1029 </w:instrText>
           </w:r>
           <w:r>
             <w:fldChar w:fldCharType="separate"/>
@@ -445,7 +445,7 @@
             <w:fldChar w:fldCharType="begin"/>
           </w:r>
           <w:r>
-            <w:instrText xml:space="preserve"> PAGEREF _Toc15053 \h </w:instrText>
+            <w:instrText xml:space="preserve"> PAGEREF _Toc1029 \h </w:instrText>
           </w:r>
           <w:r>
             <w:fldChar w:fldCharType="separate"/>
@@ -471,7 +471,7 @@
             <w:fldChar w:fldCharType="begin"/>
           </w:r>
           <w:r>
-            <w:instrText xml:space="preserve"> HYPERLINK \l _Toc23365 </w:instrText>
+            <w:instrText xml:space="preserve"> HYPERLINK \l _Toc20529 </w:instrText>
           </w:r>
           <w:r>
             <w:fldChar w:fldCharType="separate"/>
@@ -486,7 +486,7 @@
             <w:fldChar w:fldCharType="begin"/>
           </w:r>
           <w:r>
-            <w:instrText xml:space="preserve"> PAGEREF _Toc23365 \h </w:instrText>
+            <w:instrText xml:space="preserve"> PAGEREF _Toc20529 \h </w:instrText>
           </w:r>
           <w:r>
             <w:fldChar w:fldCharType="separate"/>
@@ -512,7 +512,7 @@
             <w:fldChar w:fldCharType="begin"/>
           </w:r>
           <w:r>
-            <w:instrText xml:space="preserve"> HYPERLINK \l _Toc32047 </w:instrText>
+            <w:instrText xml:space="preserve"> HYPERLINK \l _Toc28522 </w:instrText>
           </w:r>
           <w:r>
             <w:fldChar w:fldCharType="separate"/>
@@ -527,7 +527,7 @@
             <w:fldChar w:fldCharType="begin"/>
           </w:r>
           <w:r>
-            <w:instrText xml:space="preserve"> PAGEREF _Toc32047 \h </w:instrText>
+            <w:instrText xml:space="preserve"> PAGEREF _Toc28522 \h </w:instrText>
           </w:r>
           <w:r>
             <w:fldChar w:fldCharType="separate"/>
@@ -553,7 +553,7 @@
             <w:fldChar w:fldCharType="begin"/>
           </w:r>
           <w:r>
-            <w:instrText xml:space="preserve"> HYPERLINK \l _Toc11182 </w:instrText>
+            <w:instrText xml:space="preserve"> HYPERLINK \l _Toc23028 </w:instrText>
           </w:r>
           <w:r>
             <w:fldChar w:fldCharType="separate"/>
@@ -568,7 +568,7 @@
             <w:fldChar w:fldCharType="begin"/>
           </w:r>
           <w:r>
-            <w:instrText xml:space="preserve"> PAGEREF _Toc11182 \h </w:instrText>
+            <w:instrText xml:space="preserve"> PAGEREF _Toc23028 \h </w:instrText>
           </w:r>
           <w:r>
             <w:fldChar w:fldCharType="separate"/>
@@ -594,7 +594,7 @@
             <w:fldChar w:fldCharType="begin"/>
           </w:r>
           <w:r>
-            <w:instrText xml:space="preserve"> HYPERLINK \l _Toc18673 </w:instrText>
+            <w:instrText xml:space="preserve"> HYPERLINK \l _Toc1894 </w:instrText>
           </w:r>
           <w:r>
             <w:fldChar w:fldCharType="separate"/>
@@ -609,7 +609,7 @@
             <w:fldChar w:fldCharType="begin"/>
           </w:r>
           <w:r>
-            <w:instrText xml:space="preserve"> PAGEREF _Toc18673 \h </w:instrText>
+            <w:instrText xml:space="preserve"> PAGEREF _Toc1894 \h </w:instrText>
           </w:r>
           <w:r>
             <w:fldChar w:fldCharType="separate"/>
@@ -635,7 +635,7 @@
             <w:fldChar w:fldCharType="begin"/>
           </w:r>
           <w:r>
-            <w:instrText xml:space="preserve"> HYPERLINK \l _Toc1687 </w:instrText>
+            <w:instrText xml:space="preserve"> HYPERLINK \l _Toc9939 </w:instrText>
           </w:r>
           <w:r>
             <w:fldChar w:fldCharType="separate"/>
@@ -650,7 +650,7 @@
             <w:fldChar w:fldCharType="begin"/>
           </w:r>
           <w:r>
-            <w:instrText xml:space="preserve"> PAGEREF _Toc1687 \h </w:instrText>
+            <w:instrText xml:space="preserve"> PAGEREF _Toc9939 \h </w:instrText>
           </w:r>
           <w:r>
             <w:fldChar w:fldCharType="separate"/>
@@ -676,7 +676,7 @@
             <w:fldChar w:fldCharType="begin"/>
           </w:r>
           <w:r>
-            <w:instrText xml:space="preserve"> HYPERLINK \l _Toc7751 </w:instrText>
+            <w:instrText xml:space="preserve"> HYPERLINK \l _Toc17523 </w:instrText>
           </w:r>
           <w:r>
             <w:fldChar w:fldCharType="separate"/>
@@ -691,7 +691,7 @@
             <w:fldChar w:fldCharType="begin"/>
           </w:r>
           <w:r>
-            <w:instrText xml:space="preserve"> PAGEREF _Toc7751 \h </w:instrText>
+            <w:instrText xml:space="preserve"> PAGEREF _Toc17523 \h </w:instrText>
           </w:r>
           <w:r>
             <w:fldChar w:fldCharType="separate"/>
@@ -717,7 +717,7 @@
             <w:fldChar w:fldCharType="begin"/>
           </w:r>
           <w:r>
-            <w:instrText xml:space="preserve"> HYPERLINK \l _Toc29314 </w:instrText>
+            <w:instrText xml:space="preserve"> HYPERLINK \l _Toc24140 </w:instrText>
           </w:r>
           <w:r>
             <w:fldChar w:fldCharType="separate"/>
@@ -732,7 +732,7 @@
             <w:fldChar w:fldCharType="begin"/>
           </w:r>
           <w:r>
-            <w:instrText xml:space="preserve"> PAGEREF _Toc29314 \h </w:instrText>
+            <w:instrText xml:space="preserve"> PAGEREF _Toc24140 \h </w:instrText>
           </w:r>
           <w:r>
             <w:fldChar w:fldCharType="separate"/>
@@ -758,7 +758,7 @@
             <w:fldChar w:fldCharType="begin"/>
           </w:r>
           <w:r>
-            <w:instrText xml:space="preserve"> HYPERLINK \l _Toc15456 </w:instrText>
+            <w:instrText xml:space="preserve"> HYPERLINK \l _Toc17727 </w:instrText>
           </w:r>
           <w:r>
             <w:fldChar w:fldCharType="separate"/>
@@ -773,7 +773,7 @@
             <w:fldChar w:fldCharType="begin"/>
           </w:r>
           <w:r>
-            <w:instrText xml:space="preserve"> PAGEREF _Toc15456 \h </w:instrText>
+            <w:instrText xml:space="preserve"> PAGEREF _Toc17727 \h </w:instrText>
           </w:r>
           <w:r>
             <w:fldChar w:fldCharType="separate"/>
@@ -799,7 +799,7 @@
             <w:fldChar w:fldCharType="begin"/>
           </w:r>
           <w:r>
-            <w:instrText xml:space="preserve"> HYPERLINK \l _Toc459 </w:instrText>
+            <w:instrText xml:space="preserve"> HYPERLINK \l _Toc3295 </w:instrText>
           </w:r>
           <w:r>
             <w:fldChar w:fldCharType="separate"/>
@@ -814,7 +814,7 @@
             <w:fldChar w:fldCharType="begin"/>
           </w:r>
           <w:r>
-            <w:instrText xml:space="preserve"> PAGEREF _Toc459 \h </w:instrText>
+            <w:instrText xml:space="preserve"> PAGEREF _Toc3295 \h </w:instrText>
           </w:r>
           <w:r>
             <w:fldChar w:fldCharType="separate"/>
@@ -840,7 +840,7 @@
             <w:fldChar w:fldCharType="begin"/>
           </w:r>
           <w:r>
-            <w:instrText xml:space="preserve"> HYPERLINK \l _Toc9318 </w:instrText>
+            <w:instrText xml:space="preserve"> HYPERLINK \l _Toc13002 </w:instrText>
           </w:r>
           <w:r>
             <w:fldChar w:fldCharType="separate"/>
@@ -855,7 +855,7 @@
             <w:fldChar w:fldCharType="begin"/>
           </w:r>
           <w:r>
-            <w:instrText xml:space="preserve"> PAGEREF _Toc9318 \h </w:instrText>
+            <w:instrText xml:space="preserve"> PAGEREF _Toc13002 \h </w:instrText>
           </w:r>
           <w:r>
             <w:fldChar w:fldCharType="separate"/>
@@ -881,7 +881,7 @@
             <w:fldChar w:fldCharType="begin"/>
           </w:r>
           <w:r>
-            <w:instrText xml:space="preserve"> HYPERLINK \l _Toc4143 </w:instrText>
+            <w:instrText xml:space="preserve"> HYPERLINK \l _Toc13334 </w:instrText>
           </w:r>
           <w:r>
             <w:fldChar w:fldCharType="separate"/>
@@ -896,7 +896,7 @@
             <w:fldChar w:fldCharType="begin"/>
           </w:r>
           <w:r>
-            <w:instrText xml:space="preserve"> PAGEREF _Toc4143 \h </w:instrText>
+            <w:instrText xml:space="preserve"> PAGEREF _Toc13334 \h </w:instrText>
           </w:r>
           <w:r>
             <w:fldChar w:fldCharType="separate"/>
@@ -922,7 +922,7 @@
             <w:fldChar w:fldCharType="begin"/>
           </w:r>
           <w:r>
-            <w:instrText xml:space="preserve"> HYPERLINK \l _Toc3452 </w:instrText>
+            <w:instrText xml:space="preserve"> HYPERLINK \l _Toc23227 </w:instrText>
           </w:r>
           <w:r>
             <w:fldChar w:fldCharType="separate"/>
@@ -937,7 +937,7 @@
             <w:fldChar w:fldCharType="begin"/>
           </w:r>
           <w:r>
-            <w:instrText xml:space="preserve"> PAGEREF _Toc3452 \h </w:instrText>
+            <w:instrText xml:space="preserve"> PAGEREF _Toc23227 \h </w:instrText>
           </w:r>
           <w:r>
             <w:fldChar w:fldCharType="separate"/>
@@ -963,7 +963,7 @@
             <w:fldChar w:fldCharType="begin"/>
           </w:r>
           <w:r>
-            <w:instrText xml:space="preserve"> HYPERLINK \l _Toc24909 </w:instrText>
+            <w:instrText xml:space="preserve"> HYPERLINK \l _Toc7201 </w:instrText>
           </w:r>
           <w:r>
             <w:fldChar w:fldCharType="separate"/>
@@ -978,7 +978,7 @@
             <w:fldChar w:fldCharType="begin"/>
           </w:r>
           <w:r>
-            <w:instrText xml:space="preserve"> PAGEREF _Toc24909 \h </w:instrText>
+            <w:instrText xml:space="preserve"> PAGEREF _Toc7201 \h </w:instrText>
           </w:r>
           <w:r>
             <w:fldChar w:fldCharType="separate"/>
@@ -1004,7 +1004,7 @@
             <w:fldChar w:fldCharType="begin"/>
           </w:r>
           <w:r>
-            <w:instrText xml:space="preserve"> HYPERLINK \l _Toc6558 </w:instrText>
+            <w:instrText xml:space="preserve"> HYPERLINK \l _Toc22811 </w:instrText>
           </w:r>
           <w:r>
             <w:fldChar w:fldCharType="separate"/>
@@ -1019,7 +1019,7 @@
             <w:fldChar w:fldCharType="begin"/>
           </w:r>
           <w:r>
-            <w:instrText xml:space="preserve"> PAGEREF _Toc6558 \h </w:instrText>
+            <w:instrText xml:space="preserve"> PAGEREF _Toc22811 \h </w:instrText>
           </w:r>
           <w:r>
             <w:fldChar w:fldCharType="separate"/>
@@ -1045,7 +1045,7 @@
             <w:fldChar w:fldCharType="begin"/>
           </w:r>
           <w:r>
-            <w:instrText xml:space="preserve"> HYPERLINK \l _Toc20619 </w:instrText>
+            <w:instrText xml:space="preserve"> HYPERLINK \l _Toc31513 </w:instrText>
           </w:r>
           <w:r>
             <w:fldChar w:fldCharType="separate"/>
@@ -1060,7 +1060,7 @@
             <w:fldChar w:fldCharType="begin"/>
           </w:r>
           <w:r>
-            <w:instrText xml:space="preserve"> PAGEREF _Toc20619 \h </w:instrText>
+            <w:instrText xml:space="preserve"> PAGEREF _Toc31513 \h </w:instrText>
           </w:r>
           <w:r>
             <w:fldChar w:fldCharType="separate"/>
@@ -1086,7 +1086,7 @@
             <w:fldChar w:fldCharType="begin"/>
           </w:r>
           <w:r>
-            <w:instrText xml:space="preserve"> HYPERLINK \l _Toc23187 </w:instrText>
+            <w:instrText xml:space="preserve"> HYPERLINK \l _Toc13581 </w:instrText>
           </w:r>
           <w:r>
             <w:fldChar w:fldCharType="separate"/>
@@ -1101,7 +1101,7 @@
             <w:fldChar w:fldCharType="begin"/>
           </w:r>
           <w:r>
-            <w:instrText xml:space="preserve"> PAGEREF _Toc23187 \h </w:instrText>
+            <w:instrText xml:space="preserve"> PAGEREF _Toc13581 \h </w:instrText>
           </w:r>
           <w:r>
             <w:fldChar w:fldCharType="separate"/>
@@ -1127,7 +1127,7 @@
             <w:fldChar w:fldCharType="begin"/>
           </w:r>
           <w:r>
-            <w:instrText xml:space="preserve"> HYPERLINK \l _Toc1220 </w:instrText>
+            <w:instrText xml:space="preserve"> HYPERLINK \l _Toc26451 </w:instrText>
           </w:r>
           <w:r>
             <w:fldChar w:fldCharType="separate"/>
@@ -1142,7 +1142,7 @@
             <w:fldChar w:fldCharType="begin"/>
           </w:r>
           <w:r>
-            <w:instrText xml:space="preserve"> PAGEREF _Toc1220 \h </w:instrText>
+            <w:instrText xml:space="preserve"> PAGEREF _Toc26451 \h </w:instrText>
           </w:r>
           <w:r>
             <w:fldChar w:fldCharType="separate"/>
@@ -1168,7 +1168,7 @@
             <w:fldChar w:fldCharType="begin"/>
           </w:r>
           <w:r>
-            <w:instrText xml:space="preserve"> HYPERLINK \l _Toc28490 </w:instrText>
+            <w:instrText xml:space="preserve"> HYPERLINK \l _Toc12363 </w:instrText>
           </w:r>
           <w:r>
             <w:fldChar w:fldCharType="separate"/>
@@ -1183,7 +1183,7 @@
             <w:fldChar w:fldCharType="begin"/>
           </w:r>
           <w:r>
-            <w:instrText xml:space="preserve"> PAGEREF _Toc28490 \h </w:instrText>
+            <w:instrText xml:space="preserve"> PAGEREF _Toc12363 \h </w:instrText>
           </w:r>
           <w:r>
             <w:fldChar w:fldCharType="separate"/>
@@ -1209,7 +1209,7 @@
             <w:fldChar w:fldCharType="begin"/>
           </w:r>
           <w:r>
-            <w:instrText xml:space="preserve"> HYPERLINK \l _Toc28317 </w:instrText>
+            <w:instrText xml:space="preserve"> HYPERLINK \l _Toc30072 </w:instrText>
           </w:r>
           <w:r>
             <w:fldChar w:fldCharType="separate"/>
@@ -1224,7 +1224,7 @@
             <w:fldChar w:fldCharType="begin"/>
           </w:r>
           <w:r>
-            <w:instrText xml:space="preserve"> PAGEREF _Toc28317 \h </w:instrText>
+            <w:instrText xml:space="preserve"> PAGEREF _Toc30072 \h </w:instrText>
           </w:r>
           <w:r>
             <w:fldChar w:fldCharType="separate"/>
@@ -1250,7 +1250,7 @@
             <w:fldChar w:fldCharType="begin"/>
           </w:r>
           <w:r>
-            <w:instrText xml:space="preserve"> HYPERLINK \l _Toc1377 </w:instrText>
+            <w:instrText xml:space="preserve"> HYPERLINK \l _Toc18274 </w:instrText>
           </w:r>
           <w:r>
             <w:fldChar w:fldCharType="separate"/>
@@ -1265,7 +1265,7 @@
             <w:fldChar w:fldCharType="begin"/>
           </w:r>
           <w:r>
-            <w:instrText xml:space="preserve"> PAGEREF _Toc1377 \h </w:instrText>
+            <w:instrText xml:space="preserve"> PAGEREF _Toc18274 \h </w:instrText>
           </w:r>
           <w:r>
             <w:fldChar w:fldCharType="separate"/>
@@ -1296,7 +1296,7 @@
       <w:pPr>
         <w:pStyle w:val="2"/>
       </w:pPr>
-      <w:bookmarkStart w:id="0" w:name="_Toc31718"/>
+      <w:bookmarkStart w:id="0" w:name="_Toc136"/>
       <w:r>
         <w:t>1. 项目概述</w:t>
       </w:r>
@@ -1366,7 +1366,7 @@
       <w:pPr>
         <w:pStyle w:val="3"/>
       </w:pPr>
-      <w:bookmarkStart w:id="1" w:name="_Toc17159"/>
+      <w:bookmarkStart w:id="1" w:name="_Toc19439"/>
       <w:r>
         <w:t>1.1 当前实现状态</w:t>
       </w:r>
@@ -2319,7 +2319,7 @@
       <w:pPr>
         <w:pStyle w:val="2"/>
       </w:pPr>
-      <w:bookmarkStart w:id="2" w:name="_Toc18546"/>
+      <w:bookmarkStart w:id="2" w:name="_Toc15176"/>
       <w:r>
         <w:t>2. 范围与合规边界（必读）</w:t>
       </w:r>
@@ -2329,7 +2329,7 @@
       <w:pPr>
         <w:pStyle w:val="3"/>
       </w:pPr>
-      <w:bookmarkStart w:id="3" w:name="_Toc30522"/>
+      <w:bookmarkStart w:id="3" w:name="_Toc16449"/>
       <w:r>
         <w:t>2.1 范围内</w:t>
       </w:r>
@@ -2391,7 +2391,7 @@
       <w:pPr>
         <w:pStyle w:val="3"/>
       </w:pPr>
-      <w:bookmarkStart w:id="4" w:name="_Toc32632"/>
+      <w:bookmarkStart w:id="4" w:name="_Toc8503"/>
       <w:r>
         <w:t>2.2 红线</w:t>
       </w:r>
@@ -2440,7 +2440,7 @@
       <w:pPr>
         <w:pStyle w:val="2"/>
       </w:pPr>
-      <w:bookmarkStart w:id="5" w:name="_Toc29675"/>
+      <w:bookmarkStart w:id="5" w:name="_Toc13286"/>
       <w:r>
         <w:t>3. 核心指标定义</w:t>
       </w:r>
@@ -3136,7 +3136,7 @@
       <w:pPr>
         <w:pStyle w:val="2"/>
       </w:pPr>
-      <w:bookmarkStart w:id="6" w:name="_Toc20025"/>
+      <w:bookmarkStart w:id="6" w:name="_Toc2965"/>
       <w:r>
         <w:t>4. 功能需求</w:t>
       </w:r>
@@ -3146,7 +3146,7 @@
       <w:pPr>
         <w:pStyle w:val="3"/>
       </w:pPr>
-      <w:bookmarkStart w:id="7" w:name="_Toc15053"/>
+      <w:bookmarkStart w:id="7" w:name="_Toc1029"/>
       <w:r>
         <w:t>4.1 实时监控页（✅ 已实现）</w:t>
       </w:r>
@@ -3338,7 +3338,7 @@
       <w:pPr>
         <w:pStyle w:val="3"/>
       </w:pPr>
-      <w:bookmarkStart w:id="8" w:name="_Toc23365"/>
+      <w:bookmarkStart w:id="8" w:name="_Toc20529"/>
       <w:r>
         <w:t>4.2 月度汇总页（✅ 已实现）</w:t>
       </w:r>
@@ -3400,7 +3400,7 @@
       <w:pPr>
         <w:pStyle w:val="3"/>
       </w:pPr>
-      <w:bookmarkStart w:id="9" w:name="_Toc32047"/>
+      <w:bookmarkStart w:id="9" w:name="_Toc28522"/>
       <w:r>
         <w:t>4.3 广告情报页（✅ 已实现）</w:t>
       </w:r>
@@ -3449,7 +3449,7 @@
       <w:pPr>
         <w:pStyle w:val="3"/>
       </w:pPr>
-      <w:bookmarkStart w:id="10" w:name="_Toc11182"/>
+      <w:bookmarkStart w:id="10" w:name="_Toc23028"/>
       <w:r>
         <w:t>4.4 通用 / 体验（✅ 已实现）</w:t>
       </w:r>
@@ -3511,7 +3511,7 @@
       <w:pPr>
         <w:pStyle w:val="3"/>
       </w:pPr>
-      <w:bookmarkStart w:id="11" w:name="_Toc18673"/>
+      <w:bookmarkStart w:id="11" w:name="_Toc1894"/>
       <w:r>
         <w:t>4.5 待建（后端 / 扩展）</w:t>
       </w:r>
@@ -3599,7 +3599,7 @@
       <w:pPr>
         <w:pStyle w:val="2"/>
       </w:pPr>
-      <w:bookmarkStart w:id="12" w:name="_Toc1687"/>
+      <w:bookmarkStart w:id="12" w:name="_Toc9939"/>
       <w:r>
         <w:t>5. 接口契约（前后端对接）</w:t>
       </w:r>
@@ -3617,7 +3617,7 @@
       <w:pPr>
         <w:pStyle w:val="3"/>
       </w:pPr>
-      <w:bookmarkStart w:id="13" w:name="_Toc7751"/>
+      <w:bookmarkStart w:id="13" w:name="_Toc17523"/>
       <w:r>
         <w:t>5.1 GET /trends — 实时热点榜</w:t>
       </w:r>
@@ -3797,7 +3797,7 @@
       <w:pPr>
         <w:pStyle w:val="3"/>
       </w:pPr>
-      <w:bookmarkStart w:id="14" w:name="_Toc29314"/>
+      <w:bookmarkStart w:id="14" w:name="_Toc24140"/>
       <w:r>
         <w:t>5.2 GET /monthly?month=YYYY-MM — 月度汇总</w:t>
       </w:r>
@@ -3815,7 +3815,7 @@
       <w:pPr>
         <w:pStyle w:val="3"/>
       </w:pPr>
-      <w:bookmarkStart w:id="15" w:name="_Toc15456"/>
+      <w:bookmarkStart w:id="15" w:name="_Toc17727"/>
       <w:r>
         <w:t>5.3 GET /ads?q=&amp;category=&amp;region= — 广告情报</w:t>
       </w:r>
@@ -3943,7 +3943,7 @@
       <w:pPr>
         <w:pStyle w:val="3"/>
       </w:pPr>
-      <w:bookmarkStart w:id="16" w:name="_Toc459"/>
+      <w:bookmarkStart w:id="16" w:name="_Toc3295"/>
       <w:r>
         <w:t>5.4 TrendItem 数据结构</w:t>
       </w:r>
@@ -4253,7 +4253,7 @@
       <w:pPr>
         <w:pStyle w:val="3"/>
       </w:pPr>
-      <w:bookmarkStart w:id="17" w:name="_Toc9318"/>
+      <w:bookmarkStart w:id="17" w:name="_Toc13002"/>
       <w:r>
         <w:t>5.5 AdItem 数据结构</w:t>
       </w:r>
@@ -4519,7 +4519,7 @@
       <w:pPr>
         <w:pStyle w:val="2"/>
       </w:pPr>
-      <w:bookmarkStart w:id="18" w:name="_Toc4143"/>
+      <w:bookmarkStart w:id="18" w:name="_Toc13334"/>
       <w:r>
         <w:t>6. 外部数据源 API 清单（后端采集需申请）</w:t>
       </w:r>
@@ -4529,7 +4529,7 @@
       <w:pPr>
         <w:pStyle w:val="3"/>
       </w:pPr>
-      <w:bookmarkStart w:id="19" w:name="_Toc3452"/>
+      <w:bookmarkStart w:id="19" w:name="_Toc23227"/>
       <w:r>
         <w:t>6.1 MVP 必须（A 档，对应看板 6 个平台 Tab）</w:t>
       </w:r>
@@ -5855,7 +5855,7 @@
       <w:pPr>
         <w:pStyle w:val="3"/>
       </w:pPr>
-      <w:bookmarkStart w:id="20" w:name="_Toc24909"/>
+      <w:bookmarkStart w:id="20" w:name="_Toc7201"/>
       <w:r>
         <w:t>6.2 广告情报 &amp; 扩展（B/C 档）</w:t>
       </w:r>
@@ -5884,7 +5884,7 @@
         <w:spacing w:after="60" w:line="300" w:lineRule="auto"/>
       </w:pPr>
       <w:r>
-        <w:t>TikTok（前端已就绪）：官方无公开热点 API，真实公开热点数据须走第三方数据商（如 Tikapi 等）。</w:t>
+        <w:t>TikTok（前端已就绪）：推荐用官方 TikTok Creative Center（ads.tiktok.com/creative/creativeCenter → Trends），免费免登录，提供热门话题/音乐/视频/Top Ads。后端可复刻匿名令牌握手调用其 creative_radar_api 接口，或用无头浏览器渲染抓取；遵守 ToS 与频率限制。第三方数据商为备选。</w:t>
       </w:r>
     </w:p>
     <w:p>
@@ -5930,7 +5930,7 @@
       <w:pPr>
         <w:pStyle w:val="3"/>
       </w:pPr>
-      <w:bookmarkStart w:id="21" w:name="_Toc6558"/>
+      <w:bookmarkStart w:id="21" w:name="_Toc22811"/>
       <w:r>
         <w:t>6.3 密钥管理</w:t>
       </w:r>
@@ -5948,7 +5948,7 @@
       <w:pPr>
         <w:pStyle w:val="2"/>
       </w:pPr>
-      <w:bookmarkStart w:id="22" w:name="_Toc20619"/>
+      <w:bookmarkStart w:id="22" w:name="_Toc31513"/>
       <w:r>
         <w:t>7. 关键实现要点（非 API，但必须）</w:t>
       </w:r>
@@ -6010,7 +6010,7 @@
       <w:pPr>
         <w:pStyle w:val="2"/>
       </w:pPr>
-      <w:bookmarkStart w:id="23" w:name="_Toc23187"/>
+      <w:bookmarkStart w:id="23" w:name="_Toc13581"/>
       <w:r>
         <w:t>8. 非功能需求</w:t>
       </w:r>
@@ -6085,7 +6085,7 @@
       <w:pPr>
         <w:pStyle w:val="2"/>
       </w:pPr>
-      <w:bookmarkStart w:id="24" w:name="_Toc1220"/>
+      <w:bookmarkStart w:id="24" w:name="_Toc26451"/>
       <w:r>
         <w:t>9. 部署与运维（✅ 前端已上线）</w:t>
       </w:r>
@@ -6160,7 +6160,7 @@
       <w:pPr>
         <w:pStyle w:val="2"/>
       </w:pPr>
-      <w:bookmarkStart w:id="25" w:name="_Toc28490"/>
+      <w:bookmarkStart w:id="25" w:name="_Toc12363"/>
       <w:r>
         <w:t>10. 里程碑</w:t>
       </w:r>
@@ -6704,7 +6704,7 @@
       <w:pPr>
         <w:pStyle w:val="2"/>
       </w:pPr>
-      <w:bookmarkStart w:id="26" w:name="_Toc28317"/>
+      <w:bookmarkStart w:id="26" w:name="_Toc30072"/>
       <w:r>
         <w:t>11. 交付物</w:t>
       </w:r>
@@ -6779,7 +6779,7 @@
       <w:pPr>
         <w:pStyle w:val="2"/>
       </w:pPr>
-      <w:bookmarkStart w:id="27" w:name="_Toc1377"/>
+      <w:bookmarkStart w:id="27" w:name="_Toc18274"/>
       <w:r>
         <w:t>12. 验收标准</w:t>
       </w:r>
@@ -7010,9 +7010,9 @@
 <file path=word/numbering.xml><?xml version="1.0" encoding="utf-8"?>
 <w:numbering xmlns:wpc="http://schemas.microsoft.com/office/word/2010/wordprocessingCanvas" xmlns:mc="http://schemas.openxmlformats.org/markup-compatibility/2006" xmlns:o="urn:schemas-microsoft-com:office:office" xmlns:r="http://schemas.openxmlformats.org/officeDocument/2006/relationships" xmlns:m="http://schemas.openxmlformats.org/officeDocument/2006/math" xmlns:v="urn:schemas-microsoft-com:vml" xmlns:wp14="http://schemas.microsoft.com/office/word/2010/wordprocessingDrawing" xmlns:wp="http://schemas.openxmlformats.org/drawingml/2006/wordprocessingDrawing" xmlns:w10="urn:schemas-microsoft-com:office:word" xmlns:w="http://schemas.openxmlformats.org/wordprocessingml/2006/main" xmlns:w14="http://schemas.microsoft.com/office/word/2010/wordml" xmlns:wpg="http://schemas.microsoft.com/office/word/2010/wordprocessingGroup" xmlns:wpi="http://schemas.microsoft.com/office/word/2010/wordprocessingInk" xmlns:wne="http://schemas.microsoft.com/office/word/2006/wordml" xmlns:wps="http://schemas.microsoft.com/office/word/2010/wordprocessingShape" xmlns:wpsCustomData="http://www.wps.cn/officeDocument/2013/wpsCustomData" mc:Ignorable="w14 wp14">
   <w:abstractNum w:abstractNumId="0">
-    <w:nsid w:val="860F21CA"/>
+    <w:nsid w:val="97DEED21"/>
     <w:multiLevelType w:val="singleLevel"/>
-    <w:tmpl w:val="860F21CA"/>
+    <w:tmpl w:val="97DEED21"/>
     <w:lvl w:ilvl="0" w:tentative="0">
       <w:start w:val="1"/>
       <w:numFmt w:val="decimal"/>
@@ -7024,9 +7024,9 @@
     </w:lvl>
   </w:abstractNum>
   <w:abstractNum w:abstractNumId="1">
-    <w:nsid w:val="759B6D17"/>
+    <w:nsid w:val="080B40C6"/>
     <w:multiLevelType w:val="singleLevel"/>
-    <w:tmpl w:val="759B6D17"/>
+    <w:tmpl w:val="080B40C6"/>
     <w:lvl w:ilvl="0" w:tentative="0">
       <w:start w:val="1"/>
       <w:numFmt w:val="bullet"/>

</xml_diff>